<commit_message>
feat(press): update TestFlight review link to join/yANVqwV1 and refresh press kits
</commit_message>
<xml_diff>
--- a/press/downloads/de/BiSi_Pressemitteilung_DE.docx
+++ b/press/downloads/de/BiSi_Pressemitteilung_DE.docx
@@ -231,12 +231,12 @@
         <w:pStyle w:val="Heading2"/>
       </w:pPr>
       <w:r>
-        <w:t>Pressematerial und Testzugang</w:t>
+        <w:t>Pressematerial und TestFlight-Zugang</w:t>
       </w:r>
     </w:p>
     <w:p>
       <w:r>
-        <w:t>Fact Sheet, Gründer-Geschichte, Screenshots und das Promo-Video (16:9 und 9:16) in vier Sprachen sowie App-Icon und Logo stehen unter www.buzzitsay.it/press zum Download bereit. Redaktionen erhalten auf Anfrage einen Testzugang; für einen aussagekräftigen Test empfehlen wir mindestens 3 Geräte.</w:t>
+        <w:t>Fact Sheet, Gründer-Geschichte, Screenshots und das Promo-Video (16:9 und 9:16) in vier Sprachen sowie App-Icon und Logo stehen unter www.buzzitsay.it/press zum Download bereit. Redaktionen können BiSi (Version 45) direkt über TestFlight testen: https://testflight.apple.com/join/yANVqwV1 – für einen aussagekräftigen Test empfehlen wir mindestens 3 Geräte.</w:t>
       </w:r>
     </w:p>
     <w:p>

</xml_diff>